<commit_message>
Ajustados hallazgos de accesibilidad y preentrega a repositorio
</commit_message>
<xml_diff>
--- a/fuentes/CF01_12150026.docx
+++ b/fuentes/CF01_12150026.docx
@@ -1479,7 +1479,21 @@
           <w:sz w:val="20"/>
           <w:szCs w:val="20"/>
         </w:rPr>
-        <w:t>El componente formativo “Planeación y evaluación de procesos operativos en transporte” ofrece al aprendiz herramientas técnicas y prácticas para abordar la gestión de operaciones en el sector, desde la comprensión de los conceptos y tipos de transporte, hasta la aplicación de metodologías de planificación y control. A partir del conocimiento de la normativa vigente y los indicadores de gestión, se fortalecen las competencias para diseñar y evaluar procesos que optimicen recursos y garanticen el cumplimiento de objetivos organizacionales.</w:t>
+        <w:t>El componente formativo Planeación y evaluación de procesos operativos en transporte</w:t>
+      </w:r>
+      <w:r>
+        <w:rPr>
+          <w:sz w:val="20"/>
+          <w:szCs w:val="20"/>
+        </w:rPr>
+        <w:t>,</w:t>
+      </w:r>
+      <w:r>
+        <w:rPr>
+          <w:sz w:val="20"/>
+          <w:szCs w:val="20"/>
+        </w:rPr>
+        <w:t xml:space="preserve"> ofrece al aprendiz herramientas técnicas y prácticas para abordar la gestión de operaciones en el sector, desde la comprensión de los conceptos y tipos de transporte, hasta la aplicación de metodologías de planificación y control. A partir del conocimiento de la normativa vigente y los indicadores de gestión, se fortalecen las competencias para diseñar y evaluar procesos que optimicen recursos y garanticen el cumplimiento de objetivos organizacionales.</w:t>
       </w:r>
     </w:p>
     <w:p>
@@ -4152,7 +4166,7 @@
       </w:pPr>
       <w:r>
         <w:rPr>
-          <w:color w:val="000000"/>
+          <w:color w:val="000000" w:themeColor="text1" w:themeTint="FF" w:themeShade="FF"/>
           <w:sz w:val="20"/>
           <w:szCs w:val="20"/>
         </w:rPr>
@@ -4160,15 +4174,31 @@
       </w:r>
       <w:r>
         <w:rPr>
-          <w:color w:val="000000"/>
-          <w:sz w:val="20"/>
-          <w:szCs w:val="20"/>
-        </w:rPr>
-        <w:t>o KPIs,</w:t>
-      </w:r>
-      <w:r>
-        <w:rPr>
-          <w:color w:val="000000"/>
+          <w:color w:val="000000" w:themeColor="text1" w:themeTint="FF" w:themeShade="FF"/>
+          <w:sz w:val="20"/>
+          <w:szCs w:val="20"/>
+        </w:rPr>
+        <w:t xml:space="preserve">o </w:t>
+      </w:r>
+      <w:r>
+        <w:rPr>
+          <w:color w:val="000000" w:themeColor="text1" w:themeTint="FF" w:themeShade="FF"/>
+          <w:sz w:val="20"/>
+          <w:szCs w:val="20"/>
+        </w:rPr>
+        <w:t>KPIs</w:t>
+      </w:r>
+      <w:r>
+        <w:rPr>
+          <w:color w:val="000000" w:themeColor="text1" w:themeTint="FF" w:themeShade="FF"/>
+          <w:sz w:val="20"/>
+          <w:szCs w:val="20"/>
+        </w:rPr>
+        <w:t>,</w:t>
+      </w:r>
+      <w:r>
+        <w:rPr>
+          <w:color w:val="000000" w:themeColor="text1" w:themeTint="FF" w:themeShade="FF"/>
           <w:sz w:val="20"/>
           <w:szCs w:val="20"/>
         </w:rPr>
@@ -4176,21 +4206,47 @@
       </w:r>
       <w:r>
         <w:rPr>
-          <w:i/>
-          <w:iCs/>
-          <w:color w:val="000000"/>
-          <w:sz w:val="20"/>
-          <w:szCs w:val="20"/>
-        </w:rPr>
-        <w:t>Key Performance Indicators</w:t>
-      </w:r>
-      <w:r>
-        <w:rPr>
-          <w:color w:val="000000"/>
-          <w:sz w:val="20"/>
-          <w:szCs w:val="20"/>
-        </w:rPr>
-        <w:t>) son herramientas de medición cuantitativa que permiten evaluar el desempeño y el resultado de los procesos logísticos de una empresa. Su objetivo principal es monitorear el cumplimiento de los objetivos estratégicos y operativos, identificar desviaciones, y tomar decisiones informadas para mejorar la eficiencia y la productividad. En logística, estos indicadores son cruciales para medir el rendimiento en áreas como el transporte, el almacenamiento, el inventario, el servicio al cliente y la productividad general de la cadena de suministro.</w:t>
+          <w:i w:val="1"/>
+          <w:iCs w:val="1"/>
+          <w:color w:val="000000" w:themeColor="text1" w:themeTint="FF" w:themeShade="FF"/>
+          <w:sz w:val="20"/>
+          <w:szCs w:val="20"/>
+        </w:rPr>
+        <w:t xml:space="preserve">Key Performance </w:t>
+      </w:r>
+      <w:r>
+        <w:rPr>
+          <w:i w:val="1"/>
+          <w:iCs w:val="1"/>
+          <w:color w:val="000000" w:themeColor="text1" w:themeTint="FF" w:themeShade="FF"/>
+          <w:sz w:val="20"/>
+          <w:szCs w:val="20"/>
+        </w:rPr>
+        <w:t>Indicators</w:t>
+      </w:r>
+      <w:r>
+        <w:rPr>
+          <w:color w:val="000000" w:themeColor="text1" w:themeTint="FF" w:themeShade="FF"/>
+          <w:sz w:val="20"/>
+          <w:szCs w:val="20"/>
+        </w:rPr>
+        <w:t xml:space="preserve">) son herramientas de medición cuantitativa que permiten evaluar el desempeño y </w:t>
+      </w:r>
+      <w:r>
+        <w:rPr>
+          <w:color w:val="000000" w:themeColor="text1" w:themeTint="FF" w:themeShade="FF"/>
+          <w:sz w:val="20"/>
+          <w:szCs w:val="20"/>
+        </w:rPr>
+        <w:t xml:space="preserve">los resultados </w:t>
+      </w:r>
+      <w:r>
+        <w:rPr>
+          <w:color w:val="000000" w:themeColor="text1" w:themeTint="FF" w:themeShade="FF"/>
+          <w:sz w:val="20"/>
+          <w:szCs w:val="20"/>
+        </w:rPr>
+        <w:t>de los procesos logísticos de una empresa. Su objetivo principal es monitorear el cumplimiento de los objetivos estratégicos y operativos, identificar desviaciones, y tomar decisiones informadas para mejorar la eficiencia y la productividad. En logística, estos indicadores son cruciales para medir el rendimiento en áreas como el transporte, el almacenamiento, el inventario, el servicio al cliente y la productividad general de la cadena de suministro.</w:t>
       </w:r>
     </w:p>
     <w:p>
@@ -6918,6 +6974,7 @@
         <w:tc>
           <w:tcPr>
             <w:tcW w:w="5651" w:type="dxa"/>
+            <w:tcMar/>
           </w:tcPr>
           <w:p>
             <w:pPr>
@@ -6925,6 +6982,7 @@
               <w:spacing w:before="0" w:after="0" w:line="276" w:lineRule="auto"/>
               <w:outlineLvl w:val="2"/>
               <w:rPr>
+                <w:rStyle w:val="Textoennegrita"/>
                 <w:color w:val="auto"/>
                 <w:sz w:val="20"/>
                 <w:szCs w:val="20"/>
@@ -6943,8 +7001,7 @@
             <w:commentRangeEnd w:id="41"/>
             <w:r>
               <w:rPr>
-                <w:rStyle w:val="Refdecomentario"/>
-                <w:color w:val="auto"/>
+                <w:rStyle w:val="CommentReference"/>
               </w:rPr>
               <w:commentReference w:id="41"/>
             </w:r>
@@ -6956,15 +7013,6 @@
                 <w:szCs w:val="20"/>
               </w:rPr>
               <w:t xml:space="preserve"> en tiempo real y geolocalización precisa</w:t>
-            </w:r>
-            <w:r>
-              <w:rPr>
-                <w:rStyle w:val="Textoennegrita"/>
-                <w:color w:val="auto"/>
-                <w:sz w:val="20"/>
-                <w:szCs w:val="20"/>
-              </w:rPr>
-              <w:t>.</w:t>
             </w:r>
           </w:p>
           <w:p>
@@ -7066,6 +7114,7 @@
         <w:tc>
           <w:tcPr>
             <w:tcW w:w="3871" w:type="dxa"/>
+            <w:tcMar/>
           </w:tcPr>
           <w:p>
             <w:pPr>
@@ -7131,6 +7180,7 @@
         <w:tc>
           <w:tcPr>
             <w:tcW w:w="5651" w:type="dxa"/>
+            <w:tcMar/>
           </w:tcPr>
           <w:p>
             <w:pPr>
@@ -7138,22 +7188,6 @@
               <w:spacing w:before="0" w:after="0" w:line="276" w:lineRule="auto"/>
               <w:outlineLvl w:val="2"/>
               <w:rPr>
-                <w:color w:val="auto"/>
-                <w:sz w:val="20"/>
-                <w:szCs w:val="20"/>
-              </w:rPr>
-            </w:pPr>
-            <w:r>
-              <w:rPr>
-                <w:rStyle w:val="Textoennegrita"/>
-                <w:color w:val="auto"/>
-                <w:sz w:val="20"/>
-                <w:szCs w:val="20"/>
-              </w:rPr>
-              <w:t>Automatización y notificaciones inteligentes</w:t>
-            </w:r>
-            <w:r>
-              <w:rPr>
                 <w:rStyle w:val="Textoennegrita"/>
                 <w:b w:val="0"/>
                 <w:bCs w:val="0"/>
@@ -7161,7 +7195,15 @@
                 <w:sz w:val="20"/>
                 <w:szCs w:val="20"/>
               </w:rPr>
-              <w:t>.</w:t>
+            </w:pPr>
+            <w:r>
+              <w:rPr>
+                <w:rStyle w:val="Textoennegrita"/>
+                <w:color w:val="auto"/>
+                <w:sz w:val="20"/>
+                <w:szCs w:val="20"/>
+              </w:rPr>
+              <w:t>Automatización y notificaciones inteligentes</w:t>
             </w:r>
           </w:p>
           <w:p>
@@ -7263,6 +7305,7 @@
         <w:tc>
           <w:tcPr>
             <w:tcW w:w="3871" w:type="dxa"/>
+            <w:tcMar/>
           </w:tcPr>
           <w:p>
             <w:pPr>
@@ -7328,6 +7371,7 @@
         <w:tc>
           <w:tcPr>
             <w:tcW w:w="5651" w:type="dxa"/>
+            <w:tcMar/>
           </w:tcPr>
           <w:p>
             <w:pPr>
@@ -7335,20 +7379,12 @@
               <w:spacing w:before="0" w:after="0" w:line="276" w:lineRule="auto"/>
               <w:outlineLvl w:val="2"/>
               <w:rPr>
-                <w:color w:val="auto"/>
-                <w:sz w:val="20"/>
-                <w:szCs w:val="20"/>
-              </w:rPr>
-            </w:pPr>
-            <w:r>
-              <w:rPr>
                 <w:rStyle w:val="Textoennegrita"/>
                 <w:color w:val="auto"/>
                 <w:sz w:val="20"/>
                 <w:szCs w:val="20"/>
               </w:rPr>
-              <w:t>Optimización de rutas y eficiencia operativa</w:t>
-            </w:r>
+            </w:pPr>
             <w:r>
               <w:rPr>
                 <w:rStyle w:val="Textoennegrita"/>
@@ -7356,7 +7392,7 @@
                 <w:sz w:val="20"/>
                 <w:szCs w:val="20"/>
               </w:rPr>
-              <w:t>.</w:t>
+              <w:t>Optimización de rutas y eficiencia operativa</w:t>
             </w:r>
           </w:p>
           <w:p>
@@ -7458,6 +7494,7 @@
         <w:tc>
           <w:tcPr>
             <w:tcW w:w="3871" w:type="dxa"/>
+            <w:tcMar/>
           </w:tcPr>
           <w:p>
             <w:pPr>
@@ -7523,6 +7560,7 @@
         <w:tc>
           <w:tcPr>
             <w:tcW w:w="5651" w:type="dxa"/>
+            <w:tcMar/>
           </w:tcPr>
           <w:p>
             <w:pPr>
@@ -7530,20 +7568,12 @@
               <w:spacing w:before="0" w:after="0" w:line="276" w:lineRule="auto"/>
               <w:outlineLvl w:val="2"/>
               <w:rPr>
-                <w:color w:val="auto"/>
-                <w:sz w:val="20"/>
-                <w:szCs w:val="20"/>
-              </w:rPr>
-            </w:pPr>
-            <w:r>
-              <w:rPr>
                 <w:rStyle w:val="Textoennegrita"/>
                 <w:color w:val="auto"/>
                 <w:sz w:val="20"/>
                 <w:szCs w:val="20"/>
               </w:rPr>
-              <w:t>Recopilación de datos y generación de reportes</w:t>
-            </w:r>
+            </w:pPr>
             <w:r>
               <w:rPr>
                 <w:rStyle w:val="Textoennegrita"/>
@@ -7551,7 +7581,7 @@
                 <w:sz w:val="20"/>
                 <w:szCs w:val="20"/>
               </w:rPr>
-              <w:t>.</w:t>
+              <w:t>Recopilación de datos y generación de reportes</w:t>
             </w:r>
           </w:p>
           <w:p>
@@ -7653,6 +7683,7 @@
         <w:tc>
           <w:tcPr>
             <w:tcW w:w="3871" w:type="dxa"/>
+            <w:tcMar/>
           </w:tcPr>
           <w:p>
             <w:pPr>
@@ -7727,6 +7758,7 @@
         <w:tc>
           <w:tcPr>
             <w:tcW w:w="5651" w:type="dxa"/>
+            <w:tcMar/>
           </w:tcPr>
           <w:p>
             <w:pPr>
@@ -7734,20 +7766,12 @@
               <w:spacing w:before="0" w:after="0" w:line="276" w:lineRule="auto"/>
               <w:outlineLvl w:val="2"/>
               <w:rPr>
-                <w:color w:val="auto"/>
-                <w:sz w:val="20"/>
-                <w:szCs w:val="20"/>
-              </w:rPr>
-            </w:pPr>
-            <w:r>
-              <w:rPr>
                 <w:rStyle w:val="Textoennegrita"/>
                 <w:color w:val="auto"/>
                 <w:sz w:val="20"/>
                 <w:szCs w:val="20"/>
               </w:rPr>
-              <w:t>Seguridad y control</w:t>
-            </w:r>
+            </w:pPr>
             <w:r>
               <w:rPr>
                 <w:rStyle w:val="Textoennegrita"/>
@@ -7755,7 +7779,7 @@
                 <w:sz w:val="20"/>
                 <w:szCs w:val="20"/>
               </w:rPr>
-              <w:t>.</w:t>
+              <w:t>Seguridad y control</w:t>
             </w:r>
           </w:p>
           <w:p>
@@ -7860,6 +7884,7 @@
         <w:tc>
           <w:tcPr>
             <w:tcW w:w="3871" w:type="dxa"/>
+            <w:tcMar/>
           </w:tcPr>
           <w:p>
             <w:pPr>
@@ -7925,6 +7950,7 @@
         <w:tc>
           <w:tcPr>
             <w:tcW w:w="5651" w:type="dxa"/>
+            <w:tcMar/>
           </w:tcPr>
           <w:p>
             <w:pPr>
@@ -7932,20 +7958,12 @@
               <w:spacing w:before="0" w:after="0" w:line="276" w:lineRule="auto"/>
               <w:outlineLvl w:val="2"/>
               <w:rPr>
-                <w:color w:val="auto"/>
-                <w:sz w:val="20"/>
-                <w:szCs w:val="20"/>
-              </w:rPr>
-            </w:pPr>
-            <w:r>
-              <w:rPr>
                 <w:rStyle w:val="Textoennegrita"/>
                 <w:color w:val="auto"/>
                 <w:sz w:val="20"/>
                 <w:szCs w:val="20"/>
               </w:rPr>
-              <w:t>Integración y comunicación</w:t>
-            </w:r>
+            </w:pPr>
             <w:r>
               <w:rPr>
                 <w:rStyle w:val="Textoennegrita"/>
@@ -7953,7 +7971,7 @@
                 <w:sz w:val="20"/>
                 <w:szCs w:val="20"/>
               </w:rPr>
-              <w:t>.</w:t>
+              <w:t>Integración y comunicación</w:t>
             </w:r>
           </w:p>
           <w:p>
@@ -8058,6 +8076,7 @@
         <w:tc>
           <w:tcPr>
             <w:tcW w:w="3871" w:type="dxa"/>
+            <w:tcMar/>
           </w:tcPr>
           <w:p>
             <w:pPr>
@@ -10608,7 +10627,21 @@
           <w:sz w:val="20"/>
           <w:szCs w:val="20"/>
         </w:rPr>
-        <w:t xml:space="preserve">El componente formativo “Planeación y evaluación de procesos operativos en transporte” permite comprender la gestión logística aplicada al transporte, desde su conceptualización hasta el uso de herramientas de monitoreo que optimizan la cadena de suministro. Aborda el estudio del transporte, sus tipos, características, normativa y objetivos organizacionales, para luego profundizar en los indicadores de gestión como base para medir y mejorar el desempeño. </w:t>
+        <w:t>El componente formativo Planeación y evaluación de procesos operativos en transporte</w:t>
+      </w:r>
+      <w:r>
+        <w:rPr>
+          <w:sz w:val="20"/>
+          <w:szCs w:val="20"/>
+        </w:rPr>
+        <w:t>,</w:t>
+      </w:r>
+      <w:r>
+        <w:rPr>
+          <w:sz w:val="20"/>
+          <w:szCs w:val="20"/>
+        </w:rPr>
+        <w:t xml:space="preserve"> permite comprender la gestión logística aplicada al transporte, desde su conceptualización hasta el uso de herramientas de monitoreo que optimizan la cadena de suministro. Aborda el estudio del transporte, sus tipos, características, normativa y objetivos organizacionales, para luego profundizar en los indicadores de gestión como base para medir y mejorar el desempeño. </w:t>
       </w:r>
     </w:p>
     <w:p>
@@ -13020,6 +13053,176 @@
         <w:pStyle w:val="NormalWeb"/>
         <w:spacing w:line="276" w:lineRule="auto"/>
         <w:rPr>
+          <w:rFonts w:ascii="Arial" w:hAnsi="Arial" w:eastAsia="Arial" w:cs="Arial"/>
+          <w:noProof w:val="0"/>
+          <w:sz w:val="20"/>
+          <w:szCs w:val="20"/>
+          <w:lang w:val="es-CO"/>
+        </w:rPr>
+      </w:pPr>
+      <w:r>
+        <w:rPr>
+          <w:rFonts w:ascii="Arial" w:hAnsi="Arial" w:eastAsia="Arial" w:cs="Arial"/>
+          <w:noProof w:val="0"/>
+          <w:sz w:val="20"/>
+          <w:szCs w:val="20"/>
+          <w:lang w:val="es-CO"/>
+        </w:rPr>
+        <w:t xml:space="preserve">Banco Interamericano de Desarrollo. (2015). </w:t>
+      </w:r>
+      <w:r>
+        <w:rPr>
+          <w:rFonts w:ascii="Arial" w:hAnsi="Arial" w:eastAsia="Arial" w:cs="Arial"/>
+          <w:i w:val="1"/>
+          <w:iCs w:val="1"/>
+          <w:noProof w:val="0"/>
+          <w:sz w:val="20"/>
+          <w:szCs w:val="20"/>
+          <w:lang w:val="es-CO"/>
+        </w:rPr>
+        <w:t>Guía logística: aspectos conceptuales y prácticos de la logística de cargas</w:t>
+      </w:r>
+      <w:r>
+        <w:rPr>
+          <w:rFonts w:ascii="Arial" w:hAnsi="Arial" w:eastAsia="Arial" w:cs="Arial"/>
+          <w:noProof w:val="0"/>
+          <w:sz w:val="20"/>
+          <w:szCs w:val="20"/>
+          <w:lang w:val="es-CO"/>
+        </w:rPr>
+        <w:t xml:space="preserve">. </w:t>
+      </w:r>
+      <w:hyperlink r:id="R0d8b0fa9f77a4287">
+        <w:r>
+          <w:rPr>
+            <w:rStyle w:val="Hipervnculo"/>
+            <w:rFonts w:ascii="Arial" w:hAnsi="Arial" w:eastAsia="Arial" w:cs="Arial"/>
+            <w:noProof w:val="0"/>
+            <w:color w:val="auto"/>
+            <w:sz w:val="20"/>
+            <w:szCs w:val="20"/>
+            <w:u w:val="none"/>
+            <w:lang w:val="es-CO"/>
+          </w:rPr>
+          <w:t>https://publications.iadb.org/publications/spanish/document/Gu%C3%ADa-log%C3%ADstica-aspectos-conceptuales-y-pr%C3%A1cticos-de-la-log%C3%ADstica-de-cargas-%282015%29.pdf</w:t>
+        </w:r>
+      </w:hyperlink>
+      <w:r>
+        <w:rPr>
+          <w:rFonts w:ascii="Arial" w:hAnsi="Arial" w:eastAsia="Arial" w:cs="Arial"/>
+          <w:noProof w:val="0"/>
+          <w:color w:val="auto"/>
+          <w:sz w:val="20"/>
+          <w:szCs w:val="20"/>
+          <w:u w:val="none"/>
+          <w:lang w:val="es-CO"/>
+        </w:rPr>
+        <w:t xml:space="preserve"> </w:t>
+      </w:r>
+    </w:p>
+    <w:p>
+      <w:pPr>
+        <w:pStyle w:val="NormalWeb"/>
+        <w:spacing w:line="276" w:lineRule="auto"/>
+        <w:rPr>
+          <w:rFonts w:ascii="Arial" w:hAnsi="Arial" w:eastAsia="Arial" w:cs="Arial"/>
+          <w:noProof w:val="0"/>
+          <w:color w:val="auto"/>
+          <w:sz w:val="20"/>
+          <w:szCs w:val="20"/>
+          <w:u w:val="none"/>
+          <w:lang w:val="es-CO"/>
+        </w:rPr>
+      </w:pPr>
+    </w:p>
+    <w:p>
+      <w:pPr>
+        <w:pStyle w:val="NormalWeb"/>
+        <w:spacing w:line="276" w:lineRule="auto"/>
+        <w:rPr>
+          <w:rFonts w:ascii="Arial" w:hAnsi="Arial" w:eastAsia="Arial" w:cs="Arial"/>
+          <w:noProof w:val="0"/>
+          <w:color w:val="auto"/>
+          <w:sz w:val="20"/>
+          <w:szCs w:val="20"/>
+          <w:u w:val="none"/>
+          <w:lang w:val="es-CO"/>
+        </w:rPr>
+      </w:pPr>
+      <w:r>
+        <w:rPr>
+          <w:rFonts w:ascii="Arial" w:hAnsi="Arial" w:eastAsia="Arial" w:cs="Arial"/>
+          <w:noProof w:val="0"/>
+          <w:color w:val="auto"/>
+          <w:sz w:val="20"/>
+          <w:szCs w:val="20"/>
+          <w:u w:val="none"/>
+          <w:lang w:val="es-CO"/>
+        </w:rPr>
+        <w:t xml:space="preserve">Cardona Arbeláez, D., Rodríguez Arias, C. A., Del Río Cortina, J. L., Balza Franco, V., Ibarra Vega, D. W., del Río Cortina, A., García Bravo, P., … Caro Soto, M. S. (2019). </w:t>
+      </w:r>
+      <w:r>
+        <w:rPr>
+          <w:rFonts w:ascii="Arial" w:hAnsi="Arial" w:eastAsia="Arial" w:cs="Arial"/>
+          <w:i w:val="1"/>
+          <w:iCs w:val="1"/>
+          <w:noProof w:val="0"/>
+          <w:color w:val="auto"/>
+          <w:sz w:val="20"/>
+          <w:szCs w:val="20"/>
+          <w:u w:val="none"/>
+          <w:lang w:val="es-CO"/>
+        </w:rPr>
+        <w:t>Logística y cadena de suministro: aproximaciones teórico-prácticas</w:t>
+      </w:r>
+      <w:r>
+        <w:rPr>
+          <w:rFonts w:ascii="Arial" w:hAnsi="Arial" w:eastAsia="Arial" w:cs="Arial"/>
+          <w:noProof w:val="0"/>
+          <w:color w:val="auto"/>
+          <w:sz w:val="20"/>
+          <w:szCs w:val="20"/>
+          <w:u w:val="none"/>
+          <w:lang w:val="es-CO"/>
+        </w:rPr>
+        <w:t xml:space="preserve">. Editorial CECAR. </w:t>
+      </w:r>
+      <w:hyperlink r:id="R58be5df87cd3425c">
+        <w:r>
+          <w:rPr>
+            <w:rStyle w:val="Hipervnculo"/>
+            <w:rFonts w:ascii="Arial" w:hAnsi="Arial" w:eastAsia="Arial" w:cs="Arial"/>
+            <w:noProof w:val="0"/>
+            <w:color w:val="auto"/>
+            <w:sz w:val="20"/>
+            <w:szCs w:val="20"/>
+            <w:u w:val="none"/>
+            <w:lang w:val="es-CO"/>
+          </w:rPr>
+          <w:t>https://cecar.edu.co/documentos/editorial/e-book/logistica-y-cadena-de-suministro-digital.pdf</w:t>
+        </w:r>
+      </w:hyperlink>
+    </w:p>
+    <w:p>
+      <w:pPr>
+        <w:pStyle w:val="NormalWeb"/>
+        <w:spacing w:line="276" w:lineRule="auto"/>
+        <w:rPr>
+          <w:rFonts w:ascii="Arial" w:hAnsi="Arial" w:eastAsia="Arial" w:cs="Arial"/>
+          <w:noProof w:val="0"/>
+          <w:color w:val="auto"/>
+          <w:sz w:val="20"/>
+          <w:szCs w:val="20"/>
+          <w:u w:val="none"/>
+          <w:lang w:val="es-CO"/>
+        </w:rPr>
+      </w:pPr>
+    </w:p>
+    <w:p>
+      <w:pPr>
+        <w:pStyle w:val="NormalWeb"/>
+        <w:spacing w:line="276" w:lineRule="auto"/>
+        <w:rPr>
           <w:rFonts w:ascii="Arial" w:hAnsi="Arial" w:cs="Arial"/>
           <w:sz w:val="20"/>
           <w:szCs w:val="20"/>
@@ -13031,7 +13234,7 @@
           <w:sz w:val="20"/>
           <w:szCs w:val="20"/>
         </w:rPr>
-        <w:t xml:space="preserve">Mora García, L. A. (2023). </w:t>
+        <w:t xml:space="preserve">Colombia. Congreso de la República. (1996). </w:t>
       </w:r>
       <w:r>
         <w:rPr>
@@ -13040,6 +13243,190 @@
           <w:sz w:val="20"/>
           <w:szCs w:val="20"/>
         </w:rPr>
+        <w:t>Ley 336 de 1996: Por la cual se adopta el Estatuto Nacional de Transporte</w:t>
+      </w:r>
+      <w:r>
+        <w:rPr>
+          <w:rFonts w:ascii="Arial" w:hAnsi="Arial" w:cs="Arial"/>
+          <w:sz w:val="20"/>
+          <w:szCs w:val="20"/>
+        </w:rPr>
+        <w:t xml:space="preserve">. </w:t>
+      </w:r>
+      <w:hyperlink r:id="R3542fff6e21a42bf">
+        <w:r>
+          <w:rPr>
+            <w:rStyle w:val="Hipervnculo"/>
+            <w:rFonts w:ascii="Arial" w:hAnsi="Arial" w:cs="Arial"/>
+            <w:color w:val="auto"/>
+            <w:sz w:val="20"/>
+            <w:szCs w:val="20"/>
+            <w:u w:val="none"/>
+          </w:rPr>
+          <w:t>https://www.supertransporte.gov.co/documentos/2020/Diciembre/Notificaciones_16_RA/Resoluciones/860.pdf</w:t>
+        </w:r>
+      </w:hyperlink>
+    </w:p>
+    <w:p>
+      <w:pPr>
+        <w:pStyle w:val="NormalWeb"/>
+        <w:spacing w:line="276" w:lineRule="auto"/>
+        <w:rPr>
+          <w:rFonts w:ascii="Arial" w:hAnsi="Arial" w:cs="Arial"/>
+          <w:color w:val="auto"/>
+          <w:sz w:val="20"/>
+          <w:szCs w:val="20"/>
+          <w:u w:val="none"/>
+        </w:rPr>
+      </w:pPr>
+    </w:p>
+    <w:p>
+      <w:pPr>
+        <w:pStyle w:val="NormalWeb"/>
+        <w:spacing w:line="276" w:lineRule="auto"/>
+        <w:rPr>
+          <w:rFonts w:ascii="Arial" w:hAnsi="Arial" w:cs="Arial"/>
+          <w:sz w:val="20"/>
+          <w:szCs w:val="20"/>
+        </w:rPr>
+      </w:pPr>
+      <w:r>
+        <w:rPr>
+          <w:rFonts w:ascii="Arial" w:hAnsi="Arial" w:cs="Arial"/>
+          <w:sz w:val="20"/>
+          <w:szCs w:val="20"/>
+        </w:rPr>
+        <w:t xml:space="preserve">Colombia. Ministerio de Transporte. (2001). </w:t>
+      </w:r>
+      <w:r>
+        <w:rPr>
+          <w:rStyle w:val="nfasis"/>
+          <w:rFonts w:ascii="Arial" w:hAnsi="Arial" w:cs="Arial"/>
+          <w:sz w:val="20"/>
+          <w:szCs w:val="20"/>
+        </w:rPr>
+        <w:t>Decreto 173 de 2001: Por el cual se reglamenta el Servicio Público de Transporte Terrestre Automotor de Carga</w:t>
+      </w:r>
+      <w:r>
+        <w:rPr>
+          <w:rFonts w:ascii="Arial" w:hAnsi="Arial" w:cs="Arial"/>
+          <w:sz w:val="20"/>
+          <w:szCs w:val="20"/>
+        </w:rPr>
+        <w:t xml:space="preserve">. </w:t>
+      </w:r>
+      <w:hyperlink r:id="R164a0eae14c345ad">
+        <w:r>
+          <w:rPr>
+            <w:rStyle w:val="Hipervnculo"/>
+            <w:rFonts w:ascii="Arial" w:hAnsi="Arial" w:cs="Arial"/>
+            <w:color w:val="auto"/>
+            <w:sz w:val="20"/>
+            <w:szCs w:val="20"/>
+            <w:u w:val="none"/>
+          </w:rPr>
+          <w:t>https://mintransporte.gov.co/descargar.php?idFile=130</w:t>
+        </w:r>
+      </w:hyperlink>
+    </w:p>
+    <w:p>
+      <w:pPr>
+        <w:pStyle w:val="NormalWeb"/>
+        <w:spacing w:line="276" w:lineRule="auto"/>
+        <w:rPr>
+          <w:rFonts w:ascii="Arial" w:hAnsi="Arial" w:cs="Arial"/>
+          <w:color w:val="auto"/>
+          <w:sz w:val="20"/>
+          <w:szCs w:val="20"/>
+          <w:u w:val="none"/>
+        </w:rPr>
+      </w:pPr>
+    </w:p>
+    <w:p>
+      <w:pPr>
+        <w:pStyle w:val="NormalWeb"/>
+        <w:spacing w:line="276" w:lineRule="auto"/>
+        <w:rPr>
+          <w:rFonts w:ascii="Arial" w:hAnsi="Arial" w:cs="Arial"/>
+          <w:sz w:val="20"/>
+          <w:szCs w:val="20"/>
+        </w:rPr>
+      </w:pPr>
+      <w:r>
+        <w:rPr>
+          <w:rFonts w:ascii="Arial" w:hAnsi="Arial" w:cs="Arial"/>
+          <w:sz w:val="20"/>
+          <w:szCs w:val="20"/>
+        </w:rPr>
+        <w:t xml:space="preserve">Colombia. Ministerio de Transporte. (2002). </w:t>
+      </w:r>
+      <w:r>
+        <w:rPr>
+          <w:rStyle w:val="nfasis"/>
+          <w:rFonts w:ascii="Arial" w:hAnsi="Arial" w:cs="Arial"/>
+          <w:sz w:val="20"/>
+          <w:szCs w:val="20"/>
+        </w:rPr>
+        <w:t>Decreto 1609 de 2002: Por el cual se reglamenta el manejo y transporte terrestre automotor de mercancías peligrosas por carretera</w:t>
+      </w:r>
+      <w:r>
+        <w:rPr>
+          <w:rFonts w:ascii="Arial" w:hAnsi="Arial" w:cs="Arial"/>
+          <w:sz w:val="20"/>
+          <w:szCs w:val="20"/>
+        </w:rPr>
+        <w:t xml:space="preserve">. </w:t>
+      </w:r>
+      <w:hyperlink r:id="R8185061820be4b3f">
+        <w:r>
+          <w:rPr>
+            <w:rStyle w:val="Hipervnculo"/>
+            <w:rFonts w:ascii="Arial" w:hAnsi="Arial" w:cs="Arial"/>
+            <w:color w:val="auto"/>
+            <w:sz w:val="20"/>
+            <w:szCs w:val="20"/>
+            <w:u w:val="none"/>
+          </w:rPr>
+          <w:t>https://www.funcionpublica.gov.co/eva/gestornormativo/norma.php?i=6101</w:t>
+        </w:r>
+      </w:hyperlink>
+    </w:p>
+    <w:p>
+      <w:pPr>
+        <w:pStyle w:val="NormalWeb"/>
+        <w:spacing w:line="276" w:lineRule="auto"/>
+        <w:rPr>
+          <w:rFonts w:ascii="Arial" w:hAnsi="Arial" w:cs="Arial"/>
+          <w:sz w:val="20"/>
+          <w:szCs w:val="20"/>
+        </w:rPr>
+      </w:pPr>
+    </w:p>
+    <w:p>
+      <w:pPr>
+        <w:pStyle w:val="NormalWeb"/>
+        <w:spacing w:line="276" w:lineRule="auto"/>
+        <w:rPr>
+          <w:rFonts w:ascii="Arial" w:hAnsi="Arial" w:cs="Arial"/>
+          <w:sz w:val="20"/>
+          <w:szCs w:val="20"/>
+        </w:rPr>
+      </w:pPr>
+      <w:r>
+        <w:rPr>
+          <w:rFonts w:ascii="Arial" w:hAnsi="Arial" w:cs="Arial"/>
+          <w:sz w:val="20"/>
+          <w:szCs w:val="20"/>
+        </w:rPr>
+        <w:t xml:space="preserve">Mora García, L. A. (2023). </w:t>
+      </w:r>
+      <w:r>
+        <w:rPr>
+          <w:rStyle w:val="nfasis"/>
+          <w:rFonts w:ascii="Arial" w:hAnsi="Arial" w:cs="Arial"/>
+          <w:sz w:val="20"/>
+          <w:szCs w:val="20"/>
+        </w:rPr>
         <w:t>Logística del transporte y distribución de carga</w:t>
       </w:r>
       <w:r>
@@ -13050,7 +13437,6 @@
         </w:rPr>
         <w:t xml:space="preserve"> (2.ª ed.). </w:t>
       </w:r>
-      <w:proofErr w:type="spellStart"/>
       <w:r>
         <w:rPr>
           <w:rFonts w:ascii="Arial" w:hAnsi="Arial" w:cs="Arial"/>
@@ -13059,7 +13445,6 @@
         </w:rPr>
         <w:t>Ecoe</w:t>
       </w:r>
-      <w:proofErr w:type="spellEnd"/>
       <w:r>
         <w:rPr>
           <w:rFonts w:ascii="Arial" w:hAnsi="Arial" w:cs="Arial"/>
@@ -13068,7 +13453,7 @@
         </w:rPr>
         <w:t xml:space="preserve"> Ediciones. </w:t>
       </w:r>
-      <w:hyperlink r:id="R5f8bef1bb716465d">
+      <w:hyperlink r:id="R1351eff7aa2047c1">
         <w:r>
           <w:rPr>
             <w:rStyle w:val="Hipervnculo"/>
@@ -13090,84 +13475,6 @@
           <w:rFonts w:ascii="Arial" w:hAnsi="Arial" w:cs="Arial"/>
           <w:sz w:val="20"/>
           <w:szCs w:val="20"/>
-        </w:rPr>
-      </w:pPr>
-    </w:p>
-    <w:p>
-      <w:pPr>
-        <w:pStyle w:val="NormalWeb"/>
-        <w:spacing w:line="276" w:lineRule="auto"/>
-        <w:rPr>
-          <w:rFonts w:ascii="Arial" w:hAnsi="Arial" w:cs="Arial"/>
-          <w:sz w:val="20"/>
-          <w:szCs w:val="20"/>
-        </w:rPr>
-      </w:pPr>
-      <w:r>
-        <w:rPr>
-          <w:rFonts w:ascii="Arial" w:hAnsi="Arial" w:cs="Arial"/>
-          <w:sz w:val="20"/>
-          <w:szCs w:val="20"/>
-        </w:rPr>
-        <w:t xml:space="preserve">Mora, L. A., &amp; Muñoz, R. D. (2009). </w:t>
-      </w:r>
-      <w:r>
-        <w:rPr>
-          <w:rStyle w:val="nfasis"/>
-          <w:rFonts w:ascii="Arial" w:hAnsi="Arial" w:cs="Arial"/>
-          <w:sz w:val="20"/>
-          <w:szCs w:val="20"/>
-        </w:rPr>
-        <w:t>Diccionario de logística y negocios internacionales</w:t>
-      </w:r>
-      <w:r>
-        <w:rPr>
-          <w:rFonts w:ascii="Arial" w:hAnsi="Arial" w:cs="Arial"/>
-          <w:sz w:val="20"/>
-          <w:szCs w:val="20"/>
-        </w:rPr>
-        <w:t xml:space="preserve">. </w:t>
-      </w:r>
-      <w:r>
-        <w:rPr>
-          <w:rFonts w:ascii="Arial" w:hAnsi="Arial" w:cs="Arial"/>
-          <w:sz w:val="20"/>
-          <w:szCs w:val="20"/>
-        </w:rPr>
-        <w:t>Ecoe</w:t>
-      </w:r>
-      <w:r>
-        <w:rPr>
-          <w:rFonts w:ascii="Arial" w:hAnsi="Arial" w:cs="Arial"/>
-          <w:sz w:val="20"/>
-          <w:szCs w:val="20"/>
-        </w:rPr>
-        <w:t xml:space="preserve"> Ediciones. </w:t>
-      </w:r>
-      <w:hyperlink r:id="R02e498215f0d4765">
-        <w:r>
-          <w:rPr>
-            <w:rStyle w:val="Hipervnculo"/>
-            <w:rFonts w:ascii="Arial" w:hAnsi="Arial" w:cs="Arial"/>
-            <w:color w:val="auto"/>
-            <w:sz w:val="20"/>
-            <w:szCs w:val="20"/>
-            <w:u w:val="none"/>
-          </w:rPr>
-          <w:t>https://www.buscalibre.com.co/libro-diccionario-de-logistica-y-negocios-internacionales/9789586156557/p/47020569</w:t>
-        </w:r>
-      </w:hyperlink>
-    </w:p>
-    <w:p>
-      <w:pPr>
-        <w:pStyle w:val="NormalWeb"/>
-        <w:spacing w:line="276" w:lineRule="auto"/>
-        <w:rPr>
-          <w:rFonts w:ascii="Arial" w:hAnsi="Arial" w:cs="Arial"/>
-          <w:color w:val="auto"/>
-          <w:sz w:val="20"/>
-          <w:szCs w:val="20"/>
-          <w:u w:val="none"/>
         </w:rPr>
       </w:pPr>
     </w:p>
@@ -13250,265 +13557,6 @@
           <w:u w:val="none"/>
         </w:rPr>
       </w:pPr>
-    </w:p>
-    <w:p>
-      <w:pPr>
-        <w:pStyle w:val="NormalWeb"/>
-        <w:spacing w:line="276" w:lineRule="auto"/>
-        <w:rPr>
-          <w:rFonts w:ascii="Arial" w:hAnsi="Arial" w:cs="Arial"/>
-          <w:sz w:val="20"/>
-          <w:szCs w:val="20"/>
-        </w:rPr>
-      </w:pPr>
-      <w:r>
-        <w:rPr>
-          <w:rFonts w:ascii="Arial" w:hAnsi="Arial" w:cs="Arial"/>
-          <w:sz w:val="20"/>
-          <w:szCs w:val="20"/>
-        </w:rPr>
-        <w:t xml:space="preserve">Silvera Escudero, R. E. (2019). </w:t>
-      </w:r>
-      <w:r>
-        <w:rPr>
-          <w:rStyle w:val="nfasis"/>
-          <w:rFonts w:ascii="Arial" w:hAnsi="Arial" w:cs="Arial"/>
-          <w:sz w:val="20"/>
-          <w:szCs w:val="20"/>
-        </w:rPr>
-        <w:t>Logística matemática: La clave del éxito en la cadena de suministro</w:t>
-      </w:r>
-      <w:r>
-        <w:rPr>
-          <w:rFonts w:ascii="Arial" w:hAnsi="Arial" w:cs="Arial"/>
-          <w:sz w:val="20"/>
-          <w:szCs w:val="20"/>
-        </w:rPr>
-        <w:t xml:space="preserve">. </w:t>
-      </w:r>
-      <w:r>
-        <w:rPr>
-          <w:rFonts w:ascii="Arial" w:hAnsi="Arial" w:cs="Arial"/>
-          <w:sz w:val="20"/>
-          <w:szCs w:val="20"/>
-        </w:rPr>
-        <w:t>Ecoe</w:t>
-      </w:r>
-      <w:r>
-        <w:rPr>
-          <w:rFonts w:ascii="Arial" w:hAnsi="Arial" w:cs="Arial"/>
-          <w:sz w:val="20"/>
-          <w:szCs w:val="20"/>
-        </w:rPr>
-        <w:t xml:space="preserve"> Ediciones Ltda. </w:t>
-      </w:r>
-      <w:hyperlink r:id="R002dec6aff6f4416">
-        <w:r>
-          <w:rPr>
-            <w:rStyle w:val="Hipervnculo"/>
-            <w:rFonts w:ascii="Arial" w:hAnsi="Arial" w:cs="Arial"/>
-            <w:color w:val="auto"/>
-            <w:sz w:val="20"/>
-            <w:szCs w:val="20"/>
-            <w:u w:val="none"/>
-          </w:rPr>
-          <w:t>https://www.buscalibre.com.co/libro-logistica-matematica-la-,-del-exito-en-la-cadena-de-suministro-1ra-edicion/9789587719602/p/49964175</w:t>
-        </w:r>
-      </w:hyperlink>
-    </w:p>
-    <w:p>
-      <w:pPr>
-        <w:pStyle w:val="NormalWeb"/>
-        <w:spacing w:line="276" w:lineRule="auto"/>
-        <w:rPr>
-          <w:rFonts w:ascii="Arial" w:hAnsi="Arial" w:cs="Arial"/>
-          <w:color w:val="auto"/>
-          <w:sz w:val="20"/>
-          <w:szCs w:val="20"/>
-          <w:u w:val="none"/>
-        </w:rPr>
-      </w:pPr>
-    </w:p>
-    <w:p>
-      <w:pPr>
-        <w:pStyle w:val="NormalWeb"/>
-        <w:spacing w:line="276" w:lineRule="auto"/>
-        <w:rPr>
-          <w:rFonts w:ascii="Arial" w:hAnsi="Arial" w:cs="Arial"/>
-          <w:sz w:val="20"/>
-          <w:szCs w:val="20"/>
-        </w:rPr>
-      </w:pPr>
-      <w:r>
-        <w:rPr>
-          <w:rFonts w:ascii="Arial" w:hAnsi="Arial" w:cs="Arial"/>
-          <w:sz w:val="20"/>
-          <w:szCs w:val="20"/>
-        </w:rPr>
-        <w:t xml:space="preserve">Colombia. Congreso de la República. (1996). </w:t>
-      </w:r>
-      <w:r>
-        <w:rPr>
-          <w:rStyle w:val="nfasis"/>
-          <w:rFonts w:ascii="Arial" w:hAnsi="Arial" w:cs="Arial"/>
-          <w:sz w:val="20"/>
-          <w:szCs w:val="20"/>
-        </w:rPr>
-        <w:t>Ley 336 de 1996: Por la cual se adopta el Estatuto Nacional de Transporte</w:t>
-      </w:r>
-      <w:r>
-        <w:rPr>
-          <w:rFonts w:ascii="Arial" w:hAnsi="Arial" w:cs="Arial"/>
-          <w:sz w:val="20"/>
-          <w:szCs w:val="20"/>
-        </w:rPr>
-        <w:t>.</w:t>
-      </w:r>
-      <w:r>
-        <w:rPr>
-          <w:rFonts w:ascii="Arial" w:hAnsi="Arial" w:cs="Arial"/>
-          <w:sz w:val="20"/>
-          <w:szCs w:val="20"/>
-        </w:rPr>
-        <w:t xml:space="preserve"> </w:t>
-      </w:r>
-      <w:hyperlink r:id="R8de54cd36f5745de">
-        <w:r>
-          <w:rPr>
-            <w:rStyle w:val="Hipervnculo"/>
-            <w:rFonts w:ascii="Arial" w:hAnsi="Arial" w:cs="Arial"/>
-            <w:color w:val="auto"/>
-            <w:sz w:val="20"/>
-            <w:szCs w:val="20"/>
-            <w:u w:val="none"/>
-          </w:rPr>
-          <w:t>https://www.supertransporte.gov.co/documentos/2020/Diciembre/Notificaciones_16_RA/Resoluciones/860.pdf</w:t>
-        </w:r>
-      </w:hyperlink>
-    </w:p>
-    <w:p>
-      <w:pPr>
-        <w:pStyle w:val="NormalWeb"/>
-        <w:spacing w:line="276" w:lineRule="auto"/>
-        <w:rPr>
-          <w:rFonts w:ascii="Arial" w:hAnsi="Arial" w:cs="Arial"/>
-          <w:color w:val="auto"/>
-          <w:sz w:val="20"/>
-          <w:szCs w:val="20"/>
-          <w:u w:val="none"/>
-        </w:rPr>
-      </w:pPr>
-    </w:p>
-    <w:p>
-      <w:pPr>
-        <w:pStyle w:val="NormalWeb"/>
-        <w:spacing w:line="276" w:lineRule="auto"/>
-        <w:rPr>
-          <w:rFonts w:ascii="Arial" w:hAnsi="Arial" w:cs="Arial"/>
-          <w:sz w:val="20"/>
-          <w:szCs w:val="20"/>
-        </w:rPr>
-      </w:pPr>
-      <w:r>
-        <w:rPr>
-          <w:rFonts w:ascii="Arial" w:hAnsi="Arial" w:cs="Arial"/>
-          <w:sz w:val="20"/>
-          <w:szCs w:val="20"/>
-        </w:rPr>
-        <w:t xml:space="preserve">Colombia. Ministerio de Transporte. (2001). </w:t>
-      </w:r>
-      <w:r>
-        <w:rPr>
-          <w:rStyle w:val="nfasis"/>
-          <w:rFonts w:ascii="Arial" w:hAnsi="Arial" w:cs="Arial"/>
-          <w:sz w:val="20"/>
-          <w:szCs w:val="20"/>
-        </w:rPr>
-        <w:t>Decreto 173 de 2001: Por el cual se reglamenta el Servicio Público de Transporte Terrestre Automotor de Carga</w:t>
-      </w:r>
-      <w:r>
-        <w:rPr>
-          <w:rFonts w:ascii="Arial" w:hAnsi="Arial" w:cs="Arial"/>
-          <w:sz w:val="20"/>
-          <w:szCs w:val="20"/>
-        </w:rPr>
-        <w:t xml:space="preserve">. </w:t>
-      </w:r>
-      <w:hyperlink r:id="Re9ec625dd026476e">
-        <w:r>
-          <w:rPr>
-            <w:rStyle w:val="Hipervnculo"/>
-            <w:rFonts w:ascii="Arial" w:hAnsi="Arial" w:cs="Arial"/>
-            <w:color w:val="auto"/>
-            <w:sz w:val="20"/>
-            <w:szCs w:val="20"/>
-            <w:u w:val="none"/>
-          </w:rPr>
-          <w:t>https://mintransporte.gov.co/descargar.php?idFile=130</w:t>
-        </w:r>
-      </w:hyperlink>
-    </w:p>
-    <w:p>
-      <w:pPr>
-        <w:pStyle w:val="NormalWeb"/>
-        <w:spacing w:line="276" w:lineRule="auto"/>
-        <w:rPr>
-          <w:rFonts w:ascii="Arial" w:hAnsi="Arial" w:cs="Arial"/>
-          <w:color w:val="auto"/>
-          <w:sz w:val="20"/>
-          <w:szCs w:val="20"/>
-          <w:u w:val="none"/>
-        </w:rPr>
-      </w:pPr>
-    </w:p>
-    <w:p>
-      <w:pPr>
-        <w:pStyle w:val="NormalWeb"/>
-        <w:spacing w:line="276" w:lineRule="auto"/>
-        <w:rPr>
-          <w:rFonts w:ascii="Arial" w:hAnsi="Arial" w:cs="Arial"/>
-          <w:sz w:val="20"/>
-          <w:szCs w:val="20"/>
-        </w:rPr>
-      </w:pPr>
-      <w:r>
-        <w:rPr>
-          <w:rFonts w:ascii="Arial" w:hAnsi="Arial" w:cs="Arial"/>
-          <w:sz w:val="20"/>
-          <w:szCs w:val="20"/>
-        </w:rPr>
-        <w:t xml:space="preserve">Colombia. Ministerio de Transporte. (2002). </w:t>
-      </w:r>
-      <w:r>
-        <w:rPr>
-          <w:rStyle w:val="nfasis"/>
-          <w:rFonts w:ascii="Arial" w:hAnsi="Arial" w:cs="Arial"/>
-          <w:sz w:val="20"/>
-          <w:szCs w:val="20"/>
-        </w:rPr>
-        <w:t>Decreto 1609 de 2002: Por el cual se reglamenta el manejo y transporte terrestre automotor de mercancías peligrosas por carretera</w:t>
-      </w:r>
-      <w:r>
-        <w:rPr>
-          <w:rFonts w:ascii="Arial" w:hAnsi="Arial" w:cs="Arial"/>
-          <w:sz w:val="20"/>
-          <w:szCs w:val="20"/>
-        </w:rPr>
-        <w:t xml:space="preserve">. </w:t>
-      </w:r>
-      <w:hyperlink w:tgtFrame="_new" w:history="1" r:id="rId58">
-        <w:r>
-          <w:rPr>
-            <w:rStyle w:val="Hipervnculo"/>
-            <w:rFonts w:ascii="Arial" w:hAnsi="Arial" w:cs="Arial"/>
-            <w:color w:val="auto"/>
-            <w:sz w:val="20"/>
-            <w:szCs w:val="20"/>
-            <w:u w:val="none"/>
-          </w:rPr>
-          <w:t>https://www.funcionpublica.gov.co/eva/gestornormativo/norma.php?i=6101</w:t>
-        </w:r>
-      </w:hyperlink>
     </w:p>
     <w:p>
       <w:pPr>

</xml_diff>